<commit_message>
Complete desktop FMS session workflow
</commit_message>
<xml_diff>
--- a/Docs/desktop_state_table.docx
+++ b/Docs/desktop_state_table.docx
@@ -827,6 +827,283 @@
             </w:pPr>
             <w:r>
               <w:t>monitor_layer4_connected</w:t>
+            </w:r>
+          </w:p>
+        </w:tc>
+      </w:tr>
+    </w:tbl>
+    <w:p/>
+    <w:p>
+      <w:r>
+        <w:br w:type="page"/>
+      </w:r>
+    </w:p>
+    <w:p>
+      <w:r>
+        <w:lastRenderedPageBreak/>
+        <w:br w:type="page"/>
+      </w:r>
+    </w:p>
+    <w:tbl>
+      <w:tblPr>
+        <w:tblStyle w:val="GridTable1Light"/>
+        <w:tblW w:w="22883" w:type="dxa"/>
+        <w:jc w:val="center"/>
+        <w:tblLook w:val="04A0" w:firstRow="1" w:lastRow="0" w:firstColumn="1" w:lastColumn="0" w:noHBand="0" w:noVBand="1"/>
+      </w:tblPr>
+      <w:tblGrid>
+        <w:gridCol w:w="3813"/>
+        <w:gridCol w:w="3814"/>
+        <w:gridCol w:w="3814"/>
+        <w:gridCol w:w="3814"/>
+        <w:gridCol w:w="3814"/>
+        <w:gridCol w:w="3814"/>
+      </w:tblGrid>
+      <w:tr>
+        <w:trPr>
+          <w:cnfStyle w:val="100000000000" w:firstRow="1" w:lastRow="0" w:firstColumn="0" w:lastColumn="0" w:oddVBand="0" w:evenVBand="0" w:oddHBand="0" w:evenHBand="0" w:firstRowFirstColumn="0" w:firstRowLastColumn="0" w:lastRowFirstColumn="0" w:lastRowLastColumn="0"/>
+          <w:trHeight w:val="1145"/>
+          <w:jc w:val="center"/>
+        </w:trPr>
+        <w:tc>
+          <w:tcPr>
+            <w:cnfStyle w:val="001000000000" w:firstRow="0" w:lastRow="0" w:firstColumn="1" w:lastColumn="0" w:oddVBand="0" w:evenVBand="0" w:oddHBand="0" w:evenHBand="0" w:firstRowFirstColumn="0" w:firstRowLastColumn="0" w:lastRowFirstColumn="0" w:lastRowLastColumn="0"/>
+            <w:tcW w:w="3813" w:type="dxa"/>
+            <w:vAlign w:val="center"/>
+            <w:hideMark/>
+          </w:tcPr>
+          <w:p>
+            <w:pPr>
+              <w:spacing w:after="160" w:line="278" w:lineRule="auto"/>
+              <w:jc w:val="center"/>
+            </w:pPr>
+            <w:r>
+              <w:lastRenderedPageBreak/>
+              <w:t>Layer 1</w:t>
+            </w:r>
+          </w:p>
+        </w:tc>
+        <w:tc>
+          <w:tcPr>
+            <w:tcW w:w="3814" w:type="dxa"/>
+            <w:vAlign w:val="center"/>
+            <w:hideMark/>
+          </w:tcPr>
+          <w:p>
+            <w:pPr>
+              <w:spacing w:after="160" w:line="278" w:lineRule="auto"/>
+              <w:jc w:val="center"/>
+              <w:cnfStyle w:val="100000000000" w:firstRow="1" w:lastRow="0" w:firstColumn="0" w:lastColumn="0" w:oddVBand="0" w:evenVBand="0" w:oddHBand="0" w:evenHBand="0" w:firstRowFirstColumn="0" w:firstRowLastColumn="0" w:lastRowFirstColumn="0" w:lastRowLastColumn="0"/>
+            </w:pPr>
+            <w:r>
+              <w:t>Layer 2</w:t>
+            </w:r>
+          </w:p>
+        </w:tc>
+        <w:tc>
+          <w:tcPr>
+            <w:tcW w:w="3814" w:type="dxa"/>
+            <w:vAlign w:val="center"/>
+            <w:hideMark/>
+          </w:tcPr>
+          <w:p>
+            <w:pPr>
+              <w:spacing w:after="160" w:line="278" w:lineRule="auto"/>
+              <w:jc w:val="center"/>
+              <w:cnfStyle w:val="100000000000" w:firstRow="1" w:lastRow="0" w:firstColumn="0" w:lastColumn="0" w:oddVBand="0" w:evenVBand="0" w:oddHBand="0" w:evenHBand="0" w:firstRowFirstColumn="0" w:firstRowLastColumn="0" w:lastRowFirstColumn="0" w:lastRowLastColumn="0"/>
+            </w:pPr>
+            <w:r>
+              <w:t>Layer 3 / reachability</w:t>
+            </w:r>
+          </w:p>
+        </w:tc>
+        <w:tc>
+          <w:tcPr>
+            <w:tcW w:w="3814" w:type="dxa"/>
+            <w:vAlign w:val="center"/>
+          </w:tcPr>
+          <w:p>
+            <w:pPr>
+              <w:jc w:val="center"/>
+              <w:cnfStyle w:val="100000000000" w:firstRow="1" w:lastRow="0" w:firstColumn="0" w:lastColumn="0" w:oddVBand="0" w:evenVBand="0" w:oddHBand="0" w:evenHBand="0" w:firstRowFirstColumn="0" w:firstRowLastColumn="0" w:lastRowFirstColumn="0" w:lastRowLastColumn="0"/>
+            </w:pPr>
+            <w:r>
+              <w:t>WAN</w:t>
+            </w:r>
+            <w:r>
+              <w:t xml:space="preserve"> / reachability</w:t>
+            </w:r>
+          </w:p>
+        </w:tc>
+        <w:tc>
+          <w:tcPr>
+            <w:tcW w:w="3814" w:type="dxa"/>
+            <w:vAlign w:val="center"/>
+            <w:hideMark/>
+          </w:tcPr>
+          <w:p>
+            <w:pPr>
+              <w:spacing w:after="160" w:line="278" w:lineRule="auto"/>
+              <w:jc w:val="center"/>
+              <w:cnfStyle w:val="100000000000" w:firstRow="1" w:lastRow="0" w:firstColumn="0" w:lastColumn="0" w:oddVBand="0" w:evenVBand="0" w:oddHBand="0" w:evenHBand="0" w:firstRowFirstColumn="0" w:firstRowLastColumn="0" w:lastRowFirstColumn="0" w:lastRowLastColumn="0"/>
+              <w:rPr>
+                <w:b w:val="0"/>
+                <w:bCs w:val="0"/>
+              </w:rPr>
+            </w:pPr>
+            <w:r>
+              <w:t>(Main) Monitor_Apt_02</w:t>
+            </w:r>
+          </w:p>
+          <w:p>
+            <w:pPr>
+              <w:spacing w:after="160" w:line="278" w:lineRule="auto"/>
+              <w:jc w:val="center"/>
+              <w:cnfStyle w:val="100000000000" w:firstRow="1" w:lastRow="0" w:firstColumn="0" w:lastColumn="0" w:oddVBand="0" w:evenVBand="0" w:oddHBand="0" w:evenHBand="0" w:firstRowFirstColumn="0" w:firstRowLastColumn="0" w:lastRowFirstColumn="0" w:lastRowLastColumn="0"/>
+              <w:rPr>
+                <w:b w:val="0"/>
+                <w:bCs w:val="0"/>
+              </w:rPr>
+            </w:pPr>
+            <w:r>
+              <w:t>(Screen2)</w:t>
+            </w:r>
+          </w:p>
+        </w:tc>
+        <w:tc>
+          <w:tcPr>
+            <w:tcW w:w="3814" w:type="dxa"/>
+            <w:vAlign w:val="center"/>
+            <w:hideMark/>
+          </w:tcPr>
+          <w:p>
+            <w:pPr>
+              <w:spacing w:after="160" w:line="278" w:lineRule="auto"/>
+              <w:jc w:val="center"/>
+              <w:cnfStyle w:val="100000000000" w:firstRow="1" w:lastRow="0" w:firstColumn="0" w:lastColumn="0" w:oddVBand="0" w:evenVBand="0" w:oddHBand="0" w:evenHBand="0" w:firstRowFirstColumn="0" w:firstRowLastColumn="0" w:lastRowFirstColumn="0" w:lastRowLastColumn="0"/>
+              <w:rPr>
+                <w:b w:val="0"/>
+                <w:bCs w:val="0"/>
+              </w:rPr>
+            </w:pPr>
+            <w:r>
+              <w:t>(Secondary) Monitor_Apt_01</w:t>
+            </w:r>
+          </w:p>
+          <w:p>
+            <w:pPr>
+              <w:spacing w:after="160" w:line="278" w:lineRule="auto"/>
+              <w:jc w:val="center"/>
+              <w:cnfStyle w:val="100000000000" w:firstRow="1" w:lastRow="0" w:firstColumn="0" w:lastColumn="0" w:oddVBand="0" w:evenVBand="0" w:oddHBand="0" w:evenHBand="0" w:firstRowFirstColumn="0" w:firstRowLastColumn="0" w:lastRowFirstColumn="0" w:lastRowLastColumn="0"/>
+            </w:pPr>
+            <w:r>
+              <w:t>(Screen1)</w:t>
+            </w:r>
+          </w:p>
+        </w:tc>
+      </w:tr>
+      <w:tr>
+        <w:trPr>
+          <w:trHeight w:val="1145"/>
+          <w:jc w:val="center"/>
+        </w:trPr>
+        <w:tc>
+          <w:tcPr>
+            <w:cnfStyle w:val="001000000000" w:firstRow="0" w:lastRow="0" w:firstColumn="1" w:lastColumn="0" w:oddVBand="0" w:evenVBand="0" w:oddHBand="0" w:evenHBand="0" w:firstRowFirstColumn="0" w:firstRowLastColumn="0" w:lastRowFirstColumn="0" w:lastRowLastColumn="0"/>
+            <w:tcW w:w="3813" w:type="dxa"/>
+            <w:vAlign w:val="center"/>
+            <w:hideMark/>
+          </w:tcPr>
+          <w:p>
+            <w:pPr>
+              <w:spacing w:after="160" w:line="278" w:lineRule="auto"/>
+              <w:jc w:val="center"/>
+            </w:pPr>
+            <w:r>
+              <w:t>Up</w:t>
+            </w:r>
+          </w:p>
+        </w:tc>
+        <w:tc>
+          <w:tcPr>
+            <w:tcW w:w="3814" w:type="dxa"/>
+            <w:vAlign w:val="center"/>
+            <w:hideMark/>
+          </w:tcPr>
+          <w:p>
+            <w:pPr>
+              <w:spacing w:after="160" w:line="278" w:lineRule="auto"/>
+              <w:jc w:val="center"/>
+              <w:cnfStyle w:val="000000000000" w:firstRow="0" w:lastRow="0" w:firstColumn="0" w:lastColumn="0" w:oddVBand="0" w:evenVBand="0" w:oddHBand="0" w:evenHBand="0" w:firstRowFirstColumn="0" w:firstRowLastColumn="0" w:lastRowFirstColumn="0" w:lastRowLastColumn="0"/>
+            </w:pPr>
+            <w:r>
+              <w:t>Up</w:t>
+            </w:r>
+          </w:p>
+        </w:tc>
+        <w:tc>
+          <w:tcPr>
+            <w:tcW w:w="3814" w:type="dxa"/>
+            <w:vAlign w:val="center"/>
+            <w:hideMark/>
+          </w:tcPr>
+          <w:p>
+            <w:pPr>
+              <w:spacing w:after="160" w:line="278" w:lineRule="auto"/>
+              <w:jc w:val="center"/>
+              <w:cnfStyle w:val="000000000000" w:firstRow="0" w:lastRow="0" w:firstColumn="0" w:lastColumn="0" w:oddVBand="0" w:evenVBand="0" w:oddHBand="0" w:evenHBand="0" w:firstRowFirstColumn="0" w:firstRowLastColumn="0" w:lastRowFirstColumn="0" w:lastRowLastColumn="0"/>
+            </w:pPr>
+            <w:r>
+              <w:t>Down</w:t>
+            </w:r>
+          </w:p>
+        </w:tc>
+        <w:tc>
+          <w:tcPr>
+            <w:tcW w:w="3814" w:type="dxa"/>
+            <w:vAlign w:val="center"/>
+          </w:tcPr>
+          <w:p>
+            <w:pPr>
+              <w:jc w:val="center"/>
+              <w:cnfStyle w:val="000000000000" w:firstRow="0" w:lastRow="0" w:firstColumn="0" w:lastColumn="0" w:oddVBand="0" w:evenVBand="0" w:oddHBand="0" w:evenHBand="0" w:firstRowFirstColumn="0" w:firstRowLastColumn="0" w:lastRowFirstColumn="0" w:lastRowLastColumn="0"/>
+            </w:pPr>
+            <w:r>
+              <w:t>Down</w:t>
+            </w:r>
+          </w:p>
+        </w:tc>
+        <w:tc>
+          <w:tcPr>
+            <w:tcW w:w="3814" w:type="dxa"/>
+            <w:vAlign w:val="center"/>
+            <w:hideMark/>
+          </w:tcPr>
+          <w:p>
+            <w:pPr>
+              <w:spacing w:after="160" w:line="278" w:lineRule="auto"/>
+              <w:jc w:val="center"/>
+              <w:cnfStyle w:val="000000000000" w:firstRow="0" w:lastRow="0" w:firstColumn="0" w:lastColumn="0" w:oddVBand="0" w:evenVBand="0" w:oddHBand="0" w:evenHBand="0" w:firstRowFirstColumn="0" w:firstRowLastColumn="0" w:lastRowFirstColumn="0" w:lastRowLastColumn="0"/>
+            </w:pPr>
+            <w:r>
+              <w:t>monitor_layer2_connected</w:t>
+            </w:r>
+          </w:p>
+        </w:tc>
+        <w:tc>
+          <w:tcPr>
+            <w:tcW w:w="3814" w:type="dxa"/>
+            <w:vAlign w:val="center"/>
+            <w:hideMark/>
+          </w:tcPr>
+          <w:p>
+            <w:pPr>
+              <w:spacing w:after="160" w:line="278" w:lineRule="auto"/>
+              <w:jc w:val="center"/>
+              <w:cnfStyle w:val="000000000000" w:firstRow="0" w:lastRow="0" w:firstColumn="0" w:lastColumn="0" w:oddVBand="0" w:evenVBand="0" w:oddHBand="0" w:evenHBand="0" w:firstRowFirstColumn="0" w:firstRowLastColumn="0" w:lastRowFirstColumn="0" w:lastRowLastColumn="0"/>
+            </w:pPr>
+            <w:r>
+              <w:t>monitor_layer3_disconnected</w:t>
             </w:r>
           </w:p>
         </w:tc>
@@ -1243,7 +1520,7 @@
   <w:style w:type="paragraph" w:default="1" w:styleId="Normal">
     <w:name w:val="Normal"/>
     <w:qFormat/>
-    <w:rsid w:val="009B657F"/>
+    <w:rsid w:val="00B914BE"/>
   </w:style>
   <w:style w:type="paragraph" w:styleId="Heading1">
     <w:name w:val="heading 1"/>

</xml_diff>